<commit_message>
Finalize security scan report
Co-Authored-By: Claude Sonnet 5.5 <noreply@anthropic.com>
Claude-Session: https://claude.ai/code/session_017oByckJbrkrgTAvQLE1mDY
</commit_message>
<xml_diff>
--- a/reports/security-report-2026-10-06.docx
+++ b/reports/security-report-2026-10-06.docx
@@ -700,11 +700,11 @@
       </w:tblPr>
       <w:tblGrid>
         <w:gridCol w:w="900"/>
-        <w:gridCol w:w="3100"/>
+        <w:gridCol w:w="2800"/>
+        <w:gridCol w:w="1400"/>
+        <w:gridCol w:w="1700"/>
+        <w:gridCol w:w="1400"/>
         <w:gridCol w:w="1100"/>
-        <w:gridCol w:w="1700"/>
-        <w:gridCol w:w="1500"/>
-        <w:gridCol w:w="1000"/>
       </w:tblGrid>
       <w:tr>
         <w:trPr>
@@ -742,7 +742,7 @@
         </w:tc>
         <w:tc>
           <w:tcPr>
-            <w:tcW w:type="dxa" w:w="3100"/>
+            <w:tcW w:type="dxa" w:w="2800"/>
             <w:tcBorders>
               <w:top w:val="single" w:color="999999" w:sz="4"/>
               <w:left w:val="single" w:color="999999" w:sz="4"/>
@@ -772,7 +772,7 @@
         </w:tc>
         <w:tc>
           <w:tcPr>
-            <w:tcW w:type="dxa" w:w="1100"/>
+            <w:tcW w:type="dxa" w:w="1400"/>
             <w:tcBorders>
               <w:top w:val="single" w:color="999999" w:sz="4"/>
               <w:left w:val="single" w:color="999999" w:sz="4"/>
@@ -832,7 +832,7 @@
         </w:tc>
         <w:tc>
           <w:tcPr>
-            <w:tcW w:type="dxa" w:w="1500"/>
+            <w:tcW w:type="dxa" w:w="1400"/>
             <w:tcBorders>
               <w:top w:val="single" w:color="999999" w:sz="4"/>
               <w:left w:val="single" w:color="999999" w:sz="4"/>
@@ -862,7 +862,7 @@
         </w:tc>
         <w:tc>
           <w:tcPr>
-            <w:tcW w:type="dxa" w:w="1000"/>
+            <w:tcW w:type="dxa" w:w="1100"/>
             <w:tcBorders>
               <w:top w:val="single" w:color="999999" w:sz="4"/>
               <w:left w:val="single" w:color="999999" w:sz="4"/>
@@ -920,7 +920,7 @@
         </w:tc>
         <w:tc>
           <w:tcPr>
-            <w:tcW w:type="dxa" w:w="3100"/>
+            <w:tcW w:type="dxa" w:w="2800"/>
             <w:tcBorders>
               <w:top w:val="single" w:color="999999" w:sz="4"/>
               <w:left w:val="single" w:color="999999" w:sz="4"/>
@@ -946,7 +946,7 @@
         </w:tc>
         <w:tc>
           <w:tcPr>
-            <w:tcW w:type="dxa" w:w="1100"/>
+            <w:tcW w:type="dxa" w:w="1400"/>
             <w:tcBorders>
               <w:top w:val="single" w:color="999999" w:sz="4"/>
               <w:left w:val="single" w:color="999999" w:sz="4"/>
@@ -1001,7 +1001,7 @@
         </w:tc>
         <w:tc>
           <w:tcPr>
-            <w:tcW w:type="dxa" w:w="1500"/>
+            <w:tcW w:type="dxa" w:w="1400"/>
             <w:tcBorders>
               <w:top w:val="single" w:color="999999" w:sz="4"/>
               <w:left w:val="single" w:color="999999" w:sz="4"/>
@@ -1027,7 +1027,7 @@
         </w:tc>
         <w:tc>
           <w:tcPr>
-            <w:tcW w:type="dxa" w:w="1000"/>
+            <w:tcW w:type="dxa" w:w="1100"/>
             <w:tcBorders>
               <w:top w:val="single" w:color="999999" w:sz="4"/>
               <w:left w:val="single" w:color="999999" w:sz="4"/>
@@ -1081,7 +1081,7 @@
         </w:tc>
         <w:tc>
           <w:tcPr>
-            <w:tcW w:type="dxa" w:w="3100"/>
+            <w:tcW w:type="dxa" w:w="2800"/>
             <w:tcBorders>
               <w:top w:val="single" w:color="999999" w:sz="4"/>
               <w:left w:val="single" w:color="999999" w:sz="4"/>
@@ -1107,7 +1107,7 @@
         </w:tc>
         <w:tc>
           <w:tcPr>
-            <w:tcW w:type="dxa" w:w="1100"/>
+            <w:tcW w:type="dxa" w:w="1400"/>
             <w:tcBorders>
               <w:top w:val="single" w:color="999999" w:sz="4"/>
               <w:left w:val="single" w:color="999999" w:sz="4"/>
@@ -1162,7 +1162,7 @@
         </w:tc>
         <w:tc>
           <w:tcPr>
-            <w:tcW w:type="dxa" w:w="1500"/>
+            <w:tcW w:type="dxa" w:w="1400"/>
             <w:tcBorders>
               <w:top w:val="single" w:color="999999" w:sz="4"/>
               <w:left w:val="single" w:color="999999" w:sz="4"/>
@@ -1188,7 +1188,7 @@
         </w:tc>
         <w:tc>
           <w:tcPr>
-            <w:tcW w:type="dxa" w:w="1000"/>
+            <w:tcW w:type="dxa" w:w="1100"/>
             <w:tcBorders>
               <w:top w:val="single" w:color="999999" w:sz="4"/>
               <w:left w:val="single" w:color="999999" w:sz="4"/>
@@ -1242,7 +1242,7 @@
         </w:tc>
         <w:tc>
           <w:tcPr>
-            <w:tcW w:type="dxa" w:w="3100"/>
+            <w:tcW w:type="dxa" w:w="2800"/>
             <w:tcBorders>
               <w:top w:val="single" w:color="999999" w:sz="4"/>
               <w:left w:val="single" w:color="999999" w:sz="4"/>
@@ -1268,7 +1268,7 @@
         </w:tc>
         <w:tc>
           <w:tcPr>
-            <w:tcW w:type="dxa" w:w="1100"/>
+            <w:tcW w:type="dxa" w:w="1400"/>
             <w:tcBorders>
               <w:top w:val="single" w:color="999999" w:sz="4"/>
               <w:left w:val="single" w:color="999999" w:sz="4"/>
@@ -1323,7 +1323,7 @@
         </w:tc>
         <w:tc>
           <w:tcPr>
-            <w:tcW w:type="dxa" w:w="1500"/>
+            <w:tcW w:type="dxa" w:w="1400"/>
             <w:tcBorders>
               <w:top w:val="single" w:color="999999" w:sz="4"/>
               <w:left w:val="single" w:color="999999" w:sz="4"/>
@@ -1349,7 +1349,7 @@
         </w:tc>
         <w:tc>
           <w:tcPr>
-            <w:tcW w:type="dxa" w:w="1000"/>
+            <w:tcW w:type="dxa" w:w="1100"/>
             <w:tcBorders>
               <w:top w:val="single" w:color="999999" w:sz="4"/>
               <w:left w:val="single" w:color="999999" w:sz="4"/>
@@ -1403,7 +1403,7 @@
         </w:tc>
         <w:tc>
           <w:tcPr>
-            <w:tcW w:type="dxa" w:w="3100"/>
+            <w:tcW w:type="dxa" w:w="2800"/>
             <w:tcBorders>
               <w:top w:val="single" w:color="999999" w:sz="4"/>
               <w:left w:val="single" w:color="999999" w:sz="4"/>
@@ -1429,7 +1429,7 @@
         </w:tc>
         <w:tc>
           <w:tcPr>
-            <w:tcW w:type="dxa" w:w="1100"/>
+            <w:tcW w:type="dxa" w:w="1400"/>
             <w:tcBorders>
               <w:top w:val="single" w:color="999999" w:sz="4"/>
               <w:left w:val="single" w:color="999999" w:sz="4"/>
@@ -1484,7 +1484,7 @@
         </w:tc>
         <w:tc>
           <w:tcPr>
-            <w:tcW w:type="dxa" w:w="1500"/>
+            <w:tcW w:type="dxa" w:w="1400"/>
             <w:tcBorders>
               <w:top w:val="single" w:color="999999" w:sz="4"/>
               <w:left w:val="single" w:color="999999" w:sz="4"/>
@@ -1510,7 +1510,7 @@
         </w:tc>
         <w:tc>
           <w:tcPr>
-            <w:tcW w:type="dxa" w:w="1000"/>
+            <w:tcW w:type="dxa" w:w="1100"/>
             <w:tcBorders>
               <w:top w:val="single" w:color="999999" w:sz="4"/>
               <w:left w:val="single" w:color="999999" w:sz="4"/>
@@ -1564,7 +1564,7 @@
         </w:tc>
         <w:tc>
           <w:tcPr>
-            <w:tcW w:type="dxa" w:w="3100"/>
+            <w:tcW w:type="dxa" w:w="2800"/>
             <w:tcBorders>
               <w:top w:val="single" w:color="999999" w:sz="4"/>
               <w:left w:val="single" w:color="999999" w:sz="4"/>
@@ -1590,7 +1590,7 @@
         </w:tc>
         <w:tc>
           <w:tcPr>
-            <w:tcW w:type="dxa" w:w="1100"/>
+            <w:tcW w:type="dxa" w:w="1400"/>
             <w:tcBorders>
               <w:top w:val="single" w:color="999999" w:sz="4"/>
               <w:left w:val="single" w:color="999999" w:sz="4"/>
@@ -1645,7 +1645,7 @@
         </w:tc>
         <w:tc>
           <w:tcPr>
-            <w:tcW w:type="dxa" w:w="1500"/>
+            <w:tcW w:type="dxa" w:w="1400"/>
             <w:tcBorders>
               <w:top w:val="single" w:color="999999" w:sz="4"/>
               <w:left w:val="single" w:color="999999" w:sz="4"/>
@@ -1671,7 +1671,7 @@
         </w:tc>
         <w:tc>
           <w:tcPr>
-            <w:tcW w:type="dxa" w:w="1000"/>
+            <w:tcW w:type="dxa" w:w="1100"/>
             <w:tcBorders>
               <w:top w:val="single" w:color="999999" w:sz="4"/>
               <w:left w:val="single" w:color="999999" w:sz="4"/>
@@ -1725,7 +1725,7 @@
         </w:tc>
         <w:tc>
           <w:tcPr>
-            <w:tcW w:type="dxa" w:w="3100"/>
+            <w:tcW w:type="dxa" w:w="2800"/>
             <w:tcBorders>
               <w:top w:val="single" w:color="999999" w:sz="4"/>
               <w:left w:val="single" w:color="999999" w:sz="4"/>
@@ -1751,7 +1751,7 @@
         </w:tc>
         <w:tc>
           <w:tcPr>
-            <w:tcW w:type="dxa" w:w="1100"/>
+            <w:tcW w:type="dxa" w:w="1400"/>
             <w:tcBorders>
               <w:top w:val="single" w:color="999999" w:sz="4"/>
               <w:left w:val="single" w:color="999999" w:sz="4"/>
@@ -1806,7 +1806,7 @@
         </w:tc>
         <w:tc>
           <w:tcPr>
-            <w:tcW w:type="dxa" w:w="1500"/>
+            <w:tcW w:type="dxa" w:w="1400"/>
             <w:tcBorders>
               <w:top w:val="single" w:color="999999" w:sz="4"/>
               <w:left w:val="single" w:color="999999" w:sz="4"/>
@@ -1832,7 +1832,7 @@
         </w:tc>
         <w:tc>
           <w:tcPr>
-            <w:tcW w:type="dxa" w:w="1000"/>
+            <w:tcW w:type="dxa" w:w="1100"/>
             <w:tcBorders>
               <w:top w:val="single" w:color="999999" w:sz="4"/>
               <w:left w:val="single" w:color="999999" w:sz="4"/>
@@ -1886,7 +1886,7 @@
         </w:tc>
         <w:tc>
           <w:tcPr>
-            <w:tcW w:type="dxa" w:w="3100"/>
+            <w:tcW w:type="dxa" w:w="2800"/>
             <w:tcBorders>
               <w:top w:val="single" w:color="999999" w:sz="4"/>
               <w:left w:val="single" w:color="999999" w:sz="4"/>
@@ -1912,7 +1912,7 @@
         </w:tc>
         <w:tc>
           <w:tcPr>
-            <w:tcW w:type="dxa" w:w="1100"/>
+            <w:tcW w:type="dxa" w:w="1400"/>
             <w:tcBorders>
               <w:top w:val="single" w:color="999999" w:sz="4"/>
               <w:left w:val="single" w:color="999999" w:sz="4"/>
@@ -1967,7 +1967,7 @@
         </w:tc>
         <w:tc>
           <w:tcPr>
-            <w:tcW w:type="dxa" w:w="1500"/>
+            <w:tcW w:type="dxa" w:w="1400"/>
             <w:tcBorders>
               <w:top w:val="single" w:color="999999" w:sz="4"/>
               <w:left w:val="single" w:color="999999" w:sz="4"/>
@@ -1993,7 +1993,7 @@
         </w:tc>
         <w:tc>
           <w:tcPr>
-            <w:tcW w:type="dxa" w:w="1000"/>
+            <w:tcW w:type="dxa" w:w="1100"/>
             <w:tcBorders>
               <w:top w:val="single" w:color="999999" w:sz="4"/>
               <w:left w:val="single" w:color="999999" w:sz="4"/>
@@ -2047,7 +2047,7 @@
         </w:tc>
         <w:tc>
           <w:tcPr>
-            <w:tcW w:type="dxa" w:w="3100"/>
+            <w:tcW w:type="dxa" w:w="2800"/>
             <w:tcBorders>
               <w:top w:val="single" w:color="999999" w:sz="4"/>
               <w:left w:val="single" w:color="999999" w:sz="4"/>
@@ -2073,7 +2073,7 @@
         </w:tc>
         <w:tc>
           <w:tcPr>
-            <w:tcW w:type="dxa" w:w="1100"/>
+            <w:tcW w:type="dxa" w:w="1400"/>
             <w:tcBorders>
               <w:top w:val="single" w:color="999999" w:sz="4"/>
               <w:left w:val="single" w:color="999999" w:sz="4"/>
@@ -2128,7 +2128,7 @@
         </w:tc>
         <w:tc>
           <w:tcPr>
-            <w:tcW w:type="dxa" w:w="1500"/>
+            <w:tcW w:type="dxa" w:w="1400"/>
             <w:tcBorders>
               <w:top w:val="single" w:color="999999" w:sz="4"/>
               <w:left w:val="single" w:color="999999" w:sz="4"/>
@@ -2154,7 +2154,7 @@
         </w:tc>
         <w:tc>
           <w:tcPr>
-            <w:tcW w:type="dxa" w:w="1000"/>
+            <w:tcW w:type="dxa" w:w="1100"/>
             <w:tcBorders>
               <w:top w:val="single" w:color="999999" w:sz="4"/>
               <w:left w:val="single" w:color="999999" w:sz="4"/>

</xml_diff>